<commit_message>
Add Azure deployment guide + RG-scoped infra, Dockerfiles, and service updates
</commit_message>
<xml_diff>
--- a/docs/HLD_doc/Cognizant-UnifiedRewardsPlatform-HLD v1.0.docx
+++ b/docs/HLD_doc/Cognizant-UnifiedRewardsPlatform-HLD v1.0.docx
@@ -3902,8 +3902,7 @@
         <w:rPr>
           <w:rFonts w:ascii="Calibri" w:hAnsi="Calibri"/>
         </w:rPr>
-        <w:lastRenderedPageBreak/>
-        <w:t>Accounting — Full audit trail via Azure Event Hub; AuditEntry records in Azure SQL.</w:t>
+        <w:t>Accounting — Full audit trail via transactional outbox / Azure Service Bus; AuditEntry records stored per-service in SQLite (Azure SQL in production). AuditEntry fields: EventType, ActorId, ClaimId (nullable), Amount (nullable), CurrencyCode (nullable), Notes, OccurredAtUtc, RecordedAtUtc.</w:t>
       </w:r>
     </w:p>
     <w:p>
@@ -4721,7 +4720,7 @@
         <w:rPr>
           <w:rFonts w:ascii="Calibri" w:hAnsi="Calibri"/>
         </w:rPr>
-        <w:t>UC-06: Real-time Audit Logging — All domain events must be captured as immutable audit entries via Azure Event Hub, persisted for 7 years in SQL, for regulatory compliance.</w:t>
+        <w:t>UC-06: Real-time Audit Logging — All domain events captured as immutable AuditEntry records via the transactional outbox / Azure Service Bus, persisted for 7 years (DataRetentionService enforces daily purge). AuditEntries carry EventType, ActorId, ClaimId?, Amount?, CurrencyCode?, Notes, OccurredAtUtc, RecordedAtUtc. compliance.</w:t>
       </w:r>
     </w:p>
     <w:p>
@@ -14453,7 +14452,7 @@
           <w:rFonts w:ascii="Calibri" w:hAnsi="Calibri"/>
           <w:sz w:val="21"/>
         </w:rPr>
-        <w:t>Employee is the central identity entity across all seven domains. Every domain aggregate — Claim, BenefitEnrollment, CTCBreakdown, PayrollRecord, Promotion, AuditEntry — carries a foreign key to the Employee record, enforcing a single source of identity truth.</w:t>
+        <w:t>Employee is the central identity entity across all seven domains. Every domain aggregate — Claim, BenefitEnrollment, CTCBreakdown, PayrollRecord, SettlementRequest, Promotion, AuditEntry — carries a TenantId and EmployeeId FK. Monetary entities (Claim, BenefitPlan, SettlementRequest, AuditEntry) carry CurrencyCode (ISO 4217, default INR) to support multi-currency deployments.itEntry — carries a foreign key to the Employee record, enforcing a single source of identity truth.</w:t>
       </w:r>
     </w:p>
     <w:p>
@@ -17125,14 +17124,12 @@
         <w:rPr>
           <w:rFonts w:ascii="Calibri" w:hAnsi="Calibri"/>
         </w:rPr>
-        <w:t xml:space="preserve">All platform actions across all 7 microservices emit AuditEvents to Azure Event Hub (append-only, 30-day retention). Reporting Service consumes the event stream and persists AuditEntry records (immutable) in Azure SQL. AuditEntry captures: entityType, entityRef, action, performedBy (userId), performedOn (UTC), ipAddress (from HttpContext), and changeSnapshot (JSON diff of before/after </w:t>
+        <w:t>All platform actions across all 7 microservices emit domain events via the transactional outbox (Azure Service Bus in production). Reporting &amp; Compliance Service persists each event as an AuditEntry (EventType, ActorId, ClaimId?, Amount?, CurrencyCode?, Notes, OccurredAtUtc, RecordedAtUtc). DataRetentionService purges AuditEntries older than 7 years on a daily schedule (configurable via Retention:YearsToKeep). and persists AuditEntry records (immutable) in Azure SQL. AuditEntry captures: entityType, entityRef, action, performedBy (userId), performedOn (UTC), ipAddress (from HttpContext), and changeSnapshot (JSON diff of before/after state). ClaimStatusHistory provides a complete immutable record of all claim state transitions. Refer to Log Management Standard: Cognizant Corporate Security Policy.</w:t>
       </w:r>
       <w:r>
         <w:rPr>
           <w:rFonts w:ascii="Calibri" w:hAnsi="Calibri"/>
         </w:rPr>
-        <w:lastRenderedPageBreak/>
-        <w:t>state). ClaimStatusHistory provides a complete immutable record of all claim state transitions. Refer to Log Management Standard: Cognizant Corporate Security Policy.</w:t>
       </w:r>
     </w:p>
     <w:p>

</xml_diff>